<commit_message>
Replace the 1.35MB overview PDF with GitHub-readable figures.
Main still has the old Chrome/Skia PDF that the website paints as black boxes. This pack uses browser-rendered diagrams encoded as DeviceRGB JPEG, about 2.5MB for the overview spec.
</commit_message>
<xml_diff>
--- a/06_defense/export/业务场景用例清单与追溯表.docx
+++ b/06_defense/export/业务场景用例清单与追溯表.docx
@@ -1476,7 +1476,7 @@
                 <w:rFonts w:ascii="Microsoft YaHei" w:hAnsi="Microsoft YaHei" w:eastAsia="Microsoft YaHei"/>
                 <w:sz w:val="18"/>
               </w:rPr>
-              <w:t>`E2E-TC01 + ALT01/ERR01/ERR02`</w:t>
+              <w:t>`E2E-TC01`</w:t>
             </w:r>
           </w:p>
         </w:tc>
@@ -1618,7 +1618,7 @@
                 <w:rFonts w:ascii="Microsoft YaHei" w:hAnsi="Microsoft YaHei" w:eastAsia="Microsoft YaHei"/>
                 <w:sz w:val="18"/>
               </w:rPr>
-              <w:t>`E2E-TC02 + ALT01/ALT02/ALT03`</w:t>
+              <w:t>`E2E-TC02`</w:t>
             </w:r>
           </w:p>
         </w:tc>
@@ -1760,7 +1760,7 @@
                 <w:rFonts w:ascii="Microsoft YaHei" w:hAnsi="Microsoft YaHei" w:eastAsia="Microsoft YaHei"/>
                 <w:sz w:val="18"/>
               </w:rPr>
-              <w:t>`E2E-TC03 + ALT01/ALT02/ERR01`</w:t>
+              <w:t>`E2E-TC03`</w:t>
             </w:r>
           </w:p>
         </w:tc>
@@ -1902,7 +1902,7 @@
                 <w:rFonts w:ascii="Microsoft YaHei" w:hAnsi="Microsoft YaHei" w:eastAsia="Microsoft YaHei"/>
                 <w:sz w:val="18"/>
               </w:rPr>
-              <w:t>`E2E-TC04 + ALT01/ERR01/ERR02`</w:t>
+              <w:t>`E2E-TC04`</w:t>
             </w:r>
           </w:p>
         </w:tc>
@@ -2044,7 +2044,7 @@
                 <w:rFonts w:ascii="Microsoft YaHei" w:hAnsi="Microsoft YaHei" w:eastAsia="Microsoft YaHei"/>
                 <w:sz w:val="18"/>
               </w:rPr>
-              <w:t>`E2E-TC05 + ERR01`</w:t>
+              <w:t>`E2E-TC05`</w:t>
             </w:r>
           </w:p>
         </w:tc>
@@ -2186,7 +2186,7 @@
                 <w:rFonts w:ascii="Microsoft YaHei" w:hAnsi="Microsoft YaHei" w:eastAsia="Microsoft YaHei"/>
                 <w:sz w:val="18"/>
               </w:rPr>
-              <w:t>`E2E-TC06 + ALT01/ALT02`</w:t>
+              <w:t>`E2E-TC06`</w:t>
             </w:r>
           </w:p>
         </w:tc>
@@ -2328,7 +2328,7 @@
                 <w:rFonts w:ascii="Microsoft YaHei" w:hAnsi="Microsoft YaHei" w:eastAsia="Microsoft YaHei"/>
                 <w:sz w:val="18"/>
               </w:rPr>
-              <w:t>`E2E-TC07 + ERR01/ERR02`</w:t>
+              <w:t>`E2E-TC07`</w:t>
             </w:r>
           </w:p>
         </w:tc>
@@ -2470,7 +2470,7 @@
                 <w:rFonts w:ascii="Microsoft YaHei" w:hAnsi="Microsoft YaHei" w:eastAsia="Microsoft YaHei"/>
                 <w:sz w:val="18"/>
               </w:rPr>
-              <w:t>`E2E-TC08 + ALT01/ERR01`</w:t>
+              <w:t>`E2E-TC08`</w:t>
             </w:r>
           </w:p>
         </w:tc>
@@ -2612,7 +2612,7 @@
                 <w:rFonts w:ascii="Microsoft YaHei" w:hAnsi="Microsoft YaHei" w:eastAsia="Microsoft YaHei"/>
                 <w:sz w:val="18"/>
               </w:rPr>
-              <w:t>`E2E-TC09 + ALT01/ERR01`</w:t>
+              <w:t>`E2E-TC09`</w:t>
             </w:r>
           </w:p>
         </w:tc>
@@ -2754,7 +2754,7 @@
                 <w:rFonts w:ascii="Microsoft YaHei" w:hAnsi="Microsoft YaHei" w:eastAsia="Microsoft YaHei"/>
                 <w:sz w:val="18"/>
               </w:rPr>
-              <w:t>`E2E-TC10 + ALT01/ERR01`</w:t>
+              <w:t>`E2E-TC10`</w:t>
             </w:r>
           </w:p>
         </w:tc>
@@ -2896,7 +2896,7 @@
                 <w:rFonts w:ascii="Microsoft YaHei" w:hAnsi="Microsoft YaHei" w:eastAsia="Microsoft YaHei"/>
                 <w:sz w:val="18"/>
               </w:rPr>
-              <w:t>`E2E-TC11 + ERR01/ERR02`</w:t>
+              <w:t>`E2E-TC11`</w:t>
             </w:r>
           </w:p>
         </w:tc>
@@ -3038,7 +3038,7 @@
                 <w:rFonts w:ascii="Microsoft YaHei" w:hAnsi="Microsoft YaHei" w:eastAsia="Microsoft YaHei"/>
                 <w:sz w:val="18"/>
               </w:rPr>
-              <w:t>`E2E-TC12 + ALT01/ALT02`</w:t>
+              <w:t>`E2E-TC12`</w:t>
             </w:r>
           </w:p>
         </w:tc>
@@ -3075,7 +3075,7 @@
           <w:b w:val="0"/>
           <w:sz w:val="22"/>
         </w:rPr>
-        <w:t>2026-09-03 最新复核：后端 120/120 通过、1 个父入口按设计跳过，前端 100/100，单体 API 32/32，Playwright 单体与微服务入口均 42/42，微服务静态/公共层 18/18、网关 API/E2E 15/15、交付门禁 18/18。</w:t>
+        <w:t>2026-09-02 最新本地补测：后端 120 通过、1 跳过，前端 100/100，单体 API 32/32，Playwright 6/6，微服务静态/公共层 18/18、隔离集成 22/22、网关 API/E2E 15/15；softw-ci-cd #77 已完成全部测试、镜像构建和 Kind 部署验收。</w:t>
       </w:r>
     </w:p>
     <w:sectPr>

</xml_diff>